<commit_message>
Add Workshop 3 planning documents, story map and Gantt chart
- Business case, charter, stakeholder analysis and plan, requirements,
  scope statement, activity and milestone schedules, roles and RACI chart
- User story map (image and story list) and Gantt chart
- Design Workshop 3 lecture slides
- Update Workshop 1 ideation and Workshop 2 business model analysis to
  the free cloud model and Pro subscription plan
- Update README with the AI approach, Workshop 3 index and ownership
</commit_message>
<xml_diff>
--- a/docs/02-workshop-2/2. Business Model Analysis.docx
+++ b/docs/02-workshop-2/2. Business Model Analysis.docx
@@ -180,18 +180,18 @@
               <w:rPr>
                 <w:sz w:val="18"/>
               </w:rPr>
-              <w:t>• Free tier: one course, with a weekly limit on explanations and quizzes</w:t>
-            </w:r>
-          </w:p>
-          <w:p>
-            <w:pPr>
-              <w:spacing w:after="60"/>
-            </w:pPr>
-            <w:r>
-              <w:rPr>
-                <w:sz w:val="18"/>
-              </w:rPr>
-              <w:t>• Pro tier: unlimited courses, voice input, iPad sync and planned review</w:t>
+              <w:t>• Free tier: one course, running on free cloud AI models, with a weekly limit on explanations and quizzes</w:t>
+            </w:r>
+          </w:p>
+          <w:p>
+            <w:pPr>
+              <w:spacing w:after="60"/>
+            </w:pPr>
+            <w:r>
+              <w:rPr>
+                <w:sz w:val="18"/>
+              </w:rPr>
+              <w:t>• Pro tier: paid AI models for explanations, picked from the least to the most expensive, plus unlimited courses, voice input, iPad sync and planned review, within a monthly usage limit</w:t>
             </w:r>
           </w:p>
           <w:p>
@@ -297,7 +297,18 @@
               <w:rPr>
                 <w:sz w:val="18"/>
               </w:rPr>
-              <w:t>• The free tier is cheap to serve because processing runs on the student’s own device</w:t>
+              <w:t>• The free tier costs the team nothing per request because it runs on free cloud AI models</w:t>
+            </w:r>
+          </w:p>
+          <w:p>
+            <w:pPr>
+              <w:spacing w:after="60"/>
+            </w:pPr>
+            <w:r>
+              <w:rPr>
+                <w:sz w:val="18"/>
+              </w:rPr>
+              <w:t>• Pro pricing and monthly usage limits cover the cost of the paid models students choose</w:t>
             </w:r>
           </w:p>
           <w:p>
@@ -626,7 +637,7 @@
               <w:rPr>
                 <w:sz w:val="18"/>
               </w:rPr>
-              <w:t>• Local processing is already the project’s differentiator, so file privacy is the reason to pay</w:t>
+              <w:t>• Appeals to students who will not send any text to a cloud provider, so privacy is the reason to pay</w:t>
             </w:r>
           </w:p>
           <w:p>

</xml_diff>